<commit_message>
Re-center manuscript on skills-as-packages and a curated MCP+skills repository
New framing: skills are becoming a reusable unit like R packages on CRAN, and the
two experiments become the evidence base for (1) a standard for what a good skill
must contain, (2) three automated checks a skill should pass before publication
(self-consistency, reference, coherence), and (3) the design of a curated
repository for MCP servers and skills. New title, abstract, introduction,
Section 6 (standard + repository), renumbered discussion/conclusions, and updated
cover letter, README, and CITATION.

Co-Authored-By: Claude Opus 4.8 <noreply@anthropic.com>
</commit_message>
<xml_diff>
--- a/manuscript/Cover_Letter_MEE.docx
+++ b/manuscript/Cover_Letter_MEE.docx
@@ -125,7 +125,7 @@
           <w:sz w:val="22"/>
           <w:szCs w:val="22"/>
         </w:rPr>
-        <w:t xml:space="preserve">Re: Submission of an original Research Article, “Do AI skills improve the output reproducibility of ecological analyses? Controlled experiments.”</w:t>
+        <w:t xml:space="preserve">Re: Submission of an original Research Article, “Skills as the new packages: an evidence-based standard for good AI analysis skills and a curated repository for ecology.”</w:t>
       </w:r>
     </w:p>
     <w:p>
@@ -173,7 +173,7 @@
           <w:sz w:val="22"/>
           <w:szCs w:val="22"/>
         </w:rPr>
-        <w:t xml:space="preserve">. Large language models and agent tools are now widely used for ecological data analysis, and people are starting to package expert procedure into reusable, structured instructions, which we call skills, to make this help reliable. Whether skills actually improve reproducibility, and which of their parts matter, has not been tested, as far as we know. Our paper tests this directly.</w:t>
+        <w:t xml:space="preserve">. Software packages, shared through curated repositories such as CRAN, made data analysis reusable and easier to reproduce. Large language models and agent tools are now used for ecological analysis, and the structured instructions that drive them, which we call skills, are becoming a reusable unit of the same kind, but they are shared informally, without versions, tests, or review. We argue that skills should be treated like packages and distributed through a curated repository, and we use controlled experiments to work out what such a repository should require of a skill.</w:t>
       </w:r>
     </w:p>
     <w:p>
@@ -187,7 +187,7 @@
           <w:sz w:val="22"/>
           <w:szCs w:val="22"/>
         </w:rPr>
-        <w:t xml:space="preserve">The paper reports a controlled experiment. We crossed four analysis tasks with five levels of skill detail and repeated each combination ten times, for 200 runs. The tasks use the iris and Palmer Penguins datasets and real reef fish monitoring data from Cabo Pulmo National Park, Gulf of California. The five levels add one kind of instruction at a time, so we can see which part of a skill does the work. A short review of the literature sets the context, but the paper is a primary study, not a formal systematic review.</w:t>
+        <w:t xml:space="preserve">The paper reports two controlled experiments and turns their results into a proposal. The first crossed four analysis tasks with five levels of skill detail, in Python and R, for 400 runs. The second raised the output from a single number to a whole data report and used an independent judge to check whether each report used the statistics the skill specifies. The tasks use the iris and Palmer Penguins datasets and real reef fish monitoring data from Cabo Pulmo National Park, Gulf of California. From the results we set out a short standard for a good skill, three automated checks it should pass before publication, and the design of a curated repository for Model Context Protocol servers and skills. A short review of the literature sets the context, but the paper is a primary study, not a formal systematic review.</w:t>
       </w:r>
     </w:p>
     <w:p>
@@ -235,7 +235,7 @@
           <w:sz w:val="22"/>
           <w:szCs w:val="22"/>
         </w:rPr>
-        <w:t xml:space="preserve"> well. It is about method rather than one system, it supports open and reproducible practice in the age of AI-assisted analysis, it uses standard ecological datasets together with real monitoring data, and it comes with a reusable, fully open experimental design and complete materials (data, prompts, orchestration, analysis code, and document scripts) that others can build on. The study also uses an output-based definition of reproducibility that fits well with existing reporting standards such as ODMAP and PRISMA-EcoEvo.</w:t>
+        <w:t xml:space="preserve"> well. It is about method rather than one system, and it proposes concrete infrastructure for reproducible AI-assisted analysis, a standard and a curated repository for skills, in the spirit of CRAN and of reporting standards such as ODMAP and PRISMA-EcoEvo. It uses standard ecological datasets together with real monitoring data, and it comes with a reusable, fully open experimental design and complete materials (data, prompts, orchestration, analysis code, and document scripts) that others can build on.</w:t>
       </w:r>
     </w:p>
     <w:p>

</xml_diff>

<commit_message>
Match Word styling (Times New Roman 12pt) and shorten abstract to 342 words
- Theme: font Times New Roman; prose (title, headings, body, captions,
  references) at 12pt to match the author's Word edits; tables and captions
  kept slightly smaller for fit. Applies to manuscript, SI, and cover letter.
- Abstract tightened from ~450 to 342 words (under the 350 limit).

Co-Authored-By: Claude Opus 4.8 <noreply@anthropic.com>
</commit_message>
<xml_diff>
--- a/manuscript/Cover_Letter_MEE.docx
+++ b/manuscript/Cover_Letter_MEE.docx
@@ -8,7 +8,7 @@
       </w:pPr>
       <w:r>
         <w:rPr>
-          <w:rFonts w:ascii="Helvetica" w:cs="Helvetica" w:eastAsia="Helvetica" w:hAnsi="Helvetica"/>
+          <w:rFonts w:ascii="Times New Roman" w:cs="Times New Roman" w:eastAsia="Times New Roman" w:hAnsi="Times New Roman"/>
           <w:b/>
           <w:bCs/>
           <w:color w:val="1F2937"/>
@@ -24,7 +24,7 @@
       </w:pPr>
       <w:r>
         <w:rPr>
-          <w:rFonts w:ascii="Helvetica" w:cs="Helvetica" w:eastAsia="Helvetica" w:hAnsi="Helvetica"/>
+          <w:rFonts w:ascii="Times New Roman" w:cs="Times New Roman" w:eastAsia="Times New Roman" w:hAnsi="Times New Roman"/>
           <w:color w:val="1F2937"/>
           <w:sz w:val="20"/>
           <w:szCs w:val="20"/>
@@ -38,7 +38,7 @@
       </w:pPr>
       <w:r>
         <w:rPr>
-          <w:rFonts w:ascii="Helvetica" w:cs="Helvetica" w:eastAsia="Helvetica" w:hAnsi="Helvetica"/>
+          <w:rFonts w:ascii="Times New Roman" w:cs="Times New Roman" w:eastAsia="Times New Roman" w:hAnsi="Times New Roman"/>
           <w:color w:val="1F2937"/>
           <w:sz w:val="20"/>
           <w:szCs w:val="20"/>
@@ -60,7 +60,7 @@
       </w:pPr>
       <w:r>
         <w:rPr>
-          <w:rFonts w:ascii="Helvetica" w:cs="Helvetica" w:eastAsia="Helvetica" w:hAnsi="Helvetica"/>
+          <w:rFonts w:ascii="Times New Roman" w:cs="Times New Roman" w:eastAsia="Times New Roman" w:hAnsi="Times New Roman"/>
           <w:color w:val="1F2937"/>
           <w:sz w:val="20"/>
           <w:szCs w:val="20"/>
@@ -74,7 +74,7 @@
       </w:pPr>
       <w:r>
         <w:rPr>
-          <w:rFonts w:ascii="Helvetica" w:cs="Helvetica" w:eastAsia="Helvetica" w:hAnsi="Helvetica"/>
+          <w:rFonts w:ascii="Times New Roman" w:cs="Times New Roman" w:eastAsia="Times New Roman" w:hAnsi="Times New Roman"/>
           <w:color w:val="1F2937"/>
           <w:sz w:val="20"/>
           <w:szCs w:val="20"/>
@@ -88,7 +88,7 @@
       </w:pPr>
       <w:r>
         <w:rPr>
-          <w:rFonts w:ascii="Helvetica" w:cs="Helvetica" w:eastAsia="Helvetica" w:hAnsi="Helvetica"/>
+          <w:rFonts w:ascii="Times New Roman" w:cs="Times New Roman" w:eastAsia="Times New Roman" w:hAnsi="Times New Roman"/>
           <w:i/>
           <w:iCs/>
           <w:color w:val="1F2937"/>
@@ -104,7 +104,7 @@
       </w:pPr>
       <w:r>
         <w:rPr>
-          <w:rFonts w:ascii="Helvetica" w:cs="Helvetica" w:eastAsia="Helvetica" w:hAnsi="Helvetica"/>
+          <w:rFonts w:ascii="Times New Roman" w:cs="Times New Roman" w:eastAsia="Times New Roman" w:hAnsi="Times New Roman"/>
           <w:color w:val="1F2937"/>
           <w:sz w:val="20"/>
           <w:szCs w:val="20"/>
@@ -118,12 +118,12 @@
       </w:pPr>
       <w:r>
         <w:rPr>
-          <w:rFonts w:ascii="Helvetica" w:cs="Helvetica" w:eastAsia="Helvetica" w:hAnsi="Helvetica"/>
+          <w:rFonts w:ascii="Times New Roman" w:cs="Times New Roman" w:eastAsia="Times New Roman" w:hAnsi="Times New Roman"/>
           <w:b/>
           <w:bCs/>
           <w:color w:val="1F2937"/>
-          <w:sz w:val="22"/>
-          <w:szCs w:val="22"/>
+          <w:sz w:val="24"/>
+          <w:szCs w:val="24"/>
         </w:rPr>
         <w:t xml:space="preserve">Re: Submission of an original Research Article, “Skills as the new packages: an evidence-based standard for good AI analysis skills and a curated repository for ecology.”</w:t>
       </w:r>
@@ -134,10 +134,10 @@
       </w:pPr>
       <w:r>
         <w:rPr>
-          <w:rFonts w:ascii="Helvetica" w:cs="Helvetica" w:eastAsia="Helvetica" w:hAnsi="Helvetica"/>
-          <w:color w:val="1F2937"/>
-          <w:sz w:val="22"/>
-          <w:szCs w:val="22"/>
+          <w:rFonts w:ascii="Times New Roman" w:cs="Times New Roman" w:eastAsia="Times New Roman" w:hAnsi="Times New Roman"/>
+          <w:color w:val="1F2937"/>
+          <w:sz w:val="24"/>
+          <w:szCs w:val="24"/>
         </w:rPr>
         <w:t xml:space="preserve">Dear Editors,</w:t>
       </w:r>
@@ -148,30 +148,30 @@
       </w:pPr>
       <w:r>
         <w:rPr>
-          <w:rFonts w:ascii="Helvetica" w:cs="Helvetica" w:eastAsia="Helvetica" w:hAnsi="Helvetica"/>
-          <w:color w:val="1F2937"/>
-          <w:sz w:val="22"/>
-          <w:szCs w:val="22"/>
+          <w:rFonts w:ascii="Times New Roman" w:cs="Times New Roman" w:eastAsia="Times New Roman" w:hAnsi="Times New Roman"/>
+          <w:color w:val="1F2937"/>
+          <w:sz w:val="24"/>
+          <w:szCs w:val="24"/>
         </w:rPr>
         <w:t xml:space="preserve">We are pleased to submit our manuscript for consideration as a Research Article in </w:t>
       </w:r>
       <w:r>
         <w:rPr>
-          <w:rFonts w:ascii="Helvetica" w:cs="Helvetica" w:eastAsia="Helvetica" w:hAnsi="Helvetica"/>
+          <w:rFonts w:ascii="Times New Roman" w:cs="Times New Roman" w:eastAsia="Times New Roman" w:hAnsi="Times New Roman"/>
           <w:i/>
           <w:iCs/>
           <w:color w:val="1F2937"/>
-          <w:sz w:val="22"/>
-          <w:szCs w:val="22"/>
+          <w:sz w:val="24"/>
+          <w:szCs w:val="24"/>
         </w:rPr>
         <w:t xml:space="preserve">Methods in Ecology and Evolution</w:t>
       </w:r>
       <w:r>
         <w:rPr>
-          <w:rFonts w:ascii="Helvetica" w:cs="Helvetica" w:eastAsia="Helvetica" w:hAnsi="Helvetica"/>
-          <w:color w:val="1F2937"/>
-          <w:sz w:val="22"/>
-          <w:szCs w:val="22"/>
+          <w:rFonts w:ascii="Times New Roman" w:cs="Times New Roman" w:eastAsia="Times New Roman" w:hAnsi="Times New Roman"/>
+          <w:color w:val="1F2937"/>
+          <w:sz w:val="24"/>
+          <w:szCs w:val="24"/>
         </w:rPr>
         <w:t xml:space="preserve">. Software packages, shared through curated repositories such as CRAN, made data analysis reusable and easier to reproduce. Large language models and agent tools are now used for ecological analysis, and the structured instructions that drive them, which we call skills, are becoming a reusable unit of the same kind, but they are shared informally, without versions, tests, or review. We argue that skills should be treated like packages and distributed through a curated repository, and we use controlled experiments to work out what such a repository should require of a skill.</w:t>
       </w:r>
@@ -182,10 +182,10 @@
       </w:pPr>
       <w:r>
         <w:rPr>
-          <w:rFonts w:ascii="Helvetica" w:cs="Helvetica" w:eastAsia="Helvetica" w:hAnsi="Helvetica"/>
-          <w:color w:val="1F2937"/>
-          <w:sz w:val="22"/>
-          <w:szCs w:val="22"/>
+          <w:rFonts w:ascii="Times New Roman" w:cs="Times New Roman" w:eastAsia="Times New Roman" w:hAnsi="Times New Roman"/>
+          <w:color w:val="1F2937"/>
+          <w:sz w:val="24"/>
+          <w:szCs w:val="24"/>
         </w:rPr>
         <w:t xml:space="preserve">The paper reports two controlled experiments and turns their results into a proposal. The first crossed four analysis tasks with five levels of skill detail, in Python and R, for 400 runs. The second raised the output from a single number to a whole data report and used an independent judge to check whether each report used the statistics the skill specifies. The tasks use the iris and Palmer Penguins datasets and real reef fish monitoring data from Cabo Pulmo National Park, Gulf of California. From the results we set out a short standard for a good skill, three automated checks it should pass before publication, and the design of a curated repository for Model Context Protocol servers and skills. A short review of the literature sets the context, but the paper is a primary study, not a formal systematic review.</w:t>
       </w:r>
@@ -196,10 +196,10 @@
       </w:pPr>
       <w:r>
         <w:rPr>
-          <w:rFonts w:ascii="Helvetica" w:cs="Helvetica" w:eastAsia="Helvetica" w:hAnsi="Helvetica"/>
-          <w:color w:val="1F2937"/>
-          <w:sz w:val="22"/>
-          <w:szCs w:val="22"/>
+          <w:rFonts w:ascii="Times New Roman" w:cs="Times New Roman" w:eastAsia="Times New Roman" w:hAnsi="Times New Roman"/>
+          <w:color w:val="1F2937"/>
+          <w:sz w:val="24"/>
+          <w:szCs w:val="24"/>
         </w:rPr>
         <w:t xml:space="preserve">The main findings are about method, and we think they will interest a broad readership. First, skills improve reproducibility by removing choices, not by adding words, and a long but vague skill did not help and sometimes made things worse. Second, the part that matters depends on the task. Fixing the random settings (seed, split, scaling) matters where a task involves randomness, and fixing the input and method (for example how a survey unit is defined) matters where a convention is unclear. Third, reproducibility and validity are separate. On the real marine data, plain runs were perfectly consistent but gave the wrong value until a contract fixed the target quantity. We turn these results into a short, ordered set of rules for writing reproducible skills for ecology.</w:t>
       </w:r>
@@ -210,30 +210,30 @@
       </w:pPr>
       <w:r>
         <w:rPr>
-          <w:rFonts w:ascii="Helvetica" w:cs="Helvetica" w:eastAsia="Helvetica" w:hAnsi="Helvetica"/>
-          <w:color w:val="1F2937"/>
-          <w:sz w:val="22"/>
-          <w:szCs w:val="22"/>
+          <w:rFonts w:ascii="Times New Roman" w:cs="Times New Roman" w:eastAsia="Times New Roman" w:hAnsi="Times New Roman"/>
+          <w:color w:val="1F2937"/>
+          <w:sz w:val="24"/>
+          <w:szCs w:val="24"/>
         </w:rPr>
         <w:t xml:space="preserve">We believe the work fits </w:t>
       </w:r>
       <w:r>
         <w:rPr>
-          <w:rFonts w:ascii="Helvetica" w:cs="Helvetica" w:eastAsia="Helvetica" w:hAnsi="Helvetica"/>
+          <w:rFonts w:ascii="Times New Roman" w:cs="Times New Roman" w:eastAsia="Times New Roman" w:hAnsi="Times New Roman"/>
           <w:i/>
           <w:iCs/>
           <w:color w:val="1F2937"/>
-          <w:sz w:val="22"/>
-          <w:szCs w:val="22"/>
+          <w:sz w:val="24"/>
+          <w:szCs w:val="24"/>
         </w:rPr>
         <w:t xml:space="preserve">Methods in Ecology and Evolution</w:t>
       </w:r>
       <w:r>
         <w:rPr>
-          <w:rFonts w:ascii="Helvetica" w:cs="Helvetica" w:eastAsia="Helvetica" w:hAnsi="Helvetica"/>
-          <w:color w:val="1F2937"/>
-          <w:sz w:val="22"/>
-          <w:szCs w:val="22"/>
+          <w:rFonts w:ascii="Times New Roman" w:cs="Times New Roman" w:eastAsia="Times New Roman" w:hAnsi="Times New Roman"/>
+          <w:color w:val="1F2937"/>
+          <w:sz w:val="24"/>
+          <w:szCs w:val="24"/>
         </w:rPr>
         <w:t xml:space="preserve"> well. It is about method rather than one system, and it proposes concrete infrastructure for reproducible AI-assisted analysis, a standard and a curated repository for skills, in the spirit of CRAN and of reporting standards such as ODMAP and PRISMA-EcoEvo. It uses standard ecological datasets together with real monitoring data, and it comes with a reusable, fully open experimental design and complete materials (data, prompts, orchestration, analysis code, and document scripts) that others can build on.</w:t>
       </w:r>
@@ -244,10 +244,10 @@
       </w:pPr>
       <w:r>
         <w:rPr>
-          <w:rFonts w:ascii="Helvetica" w:cs="Helvetica" w:eastAsia="Helvetica" w:hAnsi="Helvetica"/>
-          <w:color w:val="1F2937"/>
-          <w:sz w:val="22"/>
-          <w:szCs w:val="22"/>
+          <w:rFonts w:ascii="Times New Roman" w:cs="Times New Roman" w:eastAsia="Times New Roman" w:hAnsi="Times New Roman"/>
+          <w:color w:val="1F2937"/>
+          <w:sz w:val="24"/>
+          <w:szCs w:val="24"/>
         </w:rPr>
         <w:t xml:space="preserve">We confirm that this manuscript is original, has not been published before, and is not under consideration elsewhere, that all authors have approved the submission, and that we have no competing interests. All data and code are provided as Supporting Information and will be archived on OSF and Zenodo with a citable DOI on acceptance. The literature review in this draft is an informal background search, and a larger pre-registered search could be added later if the editors prefer.</w:t>
       </w:r>
@@ -258,10 +258,10 @@
       </w:pPr>
       <w:r>
         <w:rPr>
-          <w:rFonts w:ascii="Helvetica" w:cs="Helvetica" w:eastAsia="Helvetica" w:hAnsi="Helvetica"/>
-          <w:color w:val="1F2937"/>
-          <w:sz w:val="22"/>
-          <w:szCs w:val="22"/>
+          <w:rFonts w:ascii="Times New Roman" w:cs="Times New Roman" w:eastAsia="Times New Roman" w:hAnsi="Times New Roman"/>
+          <w:color w:val="1F2937"/>
+          <w:sz w:val="24"/>
+          <w:szCs w:val="24"/>
         </w:rPr>
         <w:t xml:space="preserve">We would be glad to suggest reviewers with expertise in computational reproducibility, species distribution modelling, and AI for ecology. Thank you for considering our submission. We look forward to your response.</w:t>
       </w:r>
@@ -277,10 +277,10 @@
       </w:pPr>
       <w:r>
         <w:rPr>
-          <w:rFonts w:ascii="Helvetica" w:cs="Helvetica" w:eastAsia="Helvetica" w:hAnsi="Helvetica"/>
-          <w:color w:val="1F2937"/>
-          <w:sz w:val="22"/>
-          <w:szCs w:val="22"/>
+          <w:rFonts w:ascii="Times New Roman" w:cs="Times New Roman" w:eastAsia="Times New Roman" w:hAnsi="Times New Roman"/>
+          <w:color w:val="1F2937"/>
+          <w:sz w:val="24"/>
+          <w:szCs w:val="24"/>
         </w:rPr>
         <w:t xml:space="preserve">Yours sincerely,</w:t>
       </w:r>
@@ -291,10 +291,10 @@
       </w:pPr>
       <w:r>
         <w:rPr>
-          <w:rFonts w:ascii="Helvetica" w:cs="Helvetica" w:eastAsia="Helvetica" w:hAnsi="Helvetica"/>
-          <w:color w:val="1F2937"/>
-          <w:sz w:val="22"/>
-          <w:szCs w:val="22"/>
+          <w:rFonts w:ascii="Times New Roman" w:cs="Times New Roman" w:eastAsia="Times New Roman" w:hAnsi="Times New Roman"/>
+          <w:color w:val="1F2937"/>
+          <w:sz w:val="24"/>
+          <w:szCs w:val="24"/>
         </w:rPr>
         <w:t xml:space="preserve">Fabio Favoretto, on behalf of all authors</w:t>
       </w:r>
@@ -305,7 +305,7 @@
       </w:pPr>
       <w:r>
         <w:rPr>
-          <w:rFonts w:ascii="Helvetica" w:cs="Helvetica" w:eastAsia="Helvetica" w:hAnsi="Helvetica"/>
+          <w:rFonts w:ascii="Times New Roman" w:cs="Times New Roman" w:eastAsia="Times New Roman" w:hAnsi="Times New Roman"/>
           <w:color w:val="1F2937"/>
           <w:sz w:val="20"/>
           <w:szCs w:val="20"/>
@@ -319,7 +319,7 @@
       </w:pPr>
       <w:r>
         <w:rPr>
-          <w:rFonts w:ascii="Helvetica" w:cs="Helvetica" w:eastAsia="Helvetica" w:hAnsi="Helvetica"/>
+          <w:rFonts w:ascii="Times New Roman" w:cs="Times New Roman" w:eastAsia="Times New Roman" w:hAnsi="Times New Roman"/>
           <w:color w:val="1F2937"/>
           <w:sz w:val="20"/>
           <w:szCs w:val="20"/>
@@ -389,7 +389,7 @@
     </w:pPr>
     <w:r>
       <w:rPr>
-        <w:rFonts w:ascii="Helvetica" w:cs="Helvetica" w:eastAsia="Helvetica" w:hAnsi="Helvetica"/>
+        <w:rFonts w:ascii="Times New Roman" w:cs="Times New Roman" w:eastAsia="Times New Roman" w:hAnsi="Times New Roman"/>
         <w:color w:val="6B7280"/>
         <w:sz w:val="16"/>
         <w:szCs w:val="16"/>
@@ -398,7 +398,7 @@
     </w:r>
     <w:r>
       <w:rPr>
-        <w:rFonts w:ascii="Helvetica" w:cs="Helvetica" w:eastAsia="Helvetica" w:hAnsi="Helvetica"/>
+        <w:rFonts w:ascii="Times New Roman" w:cs="Times New Roman" w:eastAsia="Times New Roman" w:hAnsi="Times New Roman"/>
         <w:sz w:val="16"/>
         <w:szCs w:val="16"/>
       </w:rPr>
@@ -406,7 +406,7 @@
     </w:r>
     <w:r>
       <w:rPr>
-        <w:rFonts w:ascii="Helvetica" w:cs="Helvetica" w:eastAsia="Helvetica" w:hAnsi="Helvetica"/>
+        <w:rFonts w:ascii="Times New Roman" w:cs="Times New Roman" w:eastAsia="Times New Roman" w:hAnsi="Times New Roman"/>
         <w:color w:val="6B7280"/>
         <w:sz w:val="16"/>
         <w:szCs w:val="16"/>
@@ -594,10 +594,10 @@
   <w:docDefaults>
     <w:rPrDefault>
       <w:rPr>
-        <w:rFonts w:ascii="Helvetica" w:cs="Helvetica" w:eastAsia="Helvetica" w:hAnsi="Helvetica"/>
+        <w:rFonts w:ascii="Times New Roman" w:cs="Times New Roman" w:eastAsia="Times New Roman" w:hAnsi="Times New Roman"/>
         <w:color w:val="1F2937"/>
-        <w:sz w:val="22"/>
-        <w:szCs w:val="22"/>
+        <w:sz w:val="24"/>
+        <w:szCs w:val="24"/>
       </w:rPr>
     </w:rPrDefault>
     <w:pPrDefault>
@@ -787,12 +787,12 @@
       <w:outlineLvl w:val="0"/>
     </w:pPr>
     <w:rPr>
-      <w:rFonts w:ascii="Helvetica" w:cs="Helvetica" w:eastAsia="Helvetica" w:hAnsi="Helvetica"/>
+      <w:rFonts w:ascii="Times New Roman" w:cs="Times New Roman" w:eastAsia="Times New Roman" w:hAnsi="Times New Roman"/>
       <w:b/>
       <w:bCs/>
       <w:color w:val="111827"/>
-      <w:sz w:val="44"/>
-      <w:szCs w:val="44"/>
+      <w:sz w:val="24"/>
+      <w:szCs w:val="24"/>
     </w:rPr>
   </w:style>
   <w:style w:type="paragraph" w:styleId="Heading1">
@@ -805,12 +805,12 @@
       <w:outlineLvl w:val="0"/>
     </w:pPr>
     <w:rPr>
-      <w:rFonts w:ascii="Helvetica" w:cs="Helvetica" w:eastAsia="Helvetica" w:hAnsi="Helvetica"/>
+      <w:rFonts w:ascii="Times New Roman" w:cs="Times New Roman" w:eastAsia="Times New Roman" w:hAnsi="Times New Roman"/>
       <w:b/>
       <w:bCs/>
       <w:color w:val="111827"/>
-      <w:sz w:val="34"/>
-      <w:szCs w:val="34"/>
+      <w:sz w:val="24"/>
+      <w:szCs w:val="24"/>
     </w:rPr>
   </w:style>
   <w:style w:type="paragraph" w:styleId="Heading2">
@@ -823,12 +823,12 @@
       <w:outlineLvl w:val="1"/>
     </w:pPr>
     <w:rPr>
-      <w:rFonts w:ascii="Helvetica" w:cs="Helvetica" w:eastAsia="Helvetica" w:hAnsi="Helvetica"/>
+      <w:rFonts w:ascii="Times New Roman" w:cs="Times New Roman" w:eastAsia="Times New Roman" w:hAnsi="Times New Roman"/>
       <w:b/>
       <w:bCs/>
       <w:color w:val="111827"/>
-      <w:sz w:val="26"/>
-      <w:szCs w:val="26"/>
+      <w:sz w:val="24"/>
+      <w:szCs w:val="24"/>
     </w:rPr>
   </w:style>
   <w:style w:type="paragraph" w:styleId="Heading3">
@@ -841,12 +841,12 @@
       <w:outlineLvl w:val="2"/>
     </w:pPr>
     <w:rPr>
-      <w:rFonts w:ascii="Helvetica" w:cs="Helvetica" w:eastAsia="Helvetica" w:hAnsi="Helvetica"/>
+      <w:rFonts w:ascii="Times New Roman" w:cs="Times New Roman" w:eastAsia="Times New Roman" w:hAnsi="Times New Roman"/>
       <w:b/>
       <w:bCs/>
       <w:color w:val="111827"/>
-      <w:sz w:val="23"/>
-      <w:szCs w:val="23"/>
+      <w:sz w:val="24"/>
+      <w:szCs w:val="24"/>
     </w:rPr>
   </w:style>
 </w:styles>

</xml_diff>

<commit_message>
Conform manuscript to MEE author guidelines
- Double line spacing for the manuscript (SI, cover letter, title page single).
- Double-anonymous: remove author/affiliation/GitHub/lab identifiers from the
  main text and SI; add a separate non-anonymised title page (authors, running
  headline <=45 chars, acknowledgements, author contributions, inclusion, data
  availability, conflict of interest, funding).
- Add a Data-and-code-for-peer-review statement under the abstract.
- Key-words: 8, alphabetical order, "Key-words" label.
- Add required Use-of-AI statement in Methods (3.8).
- Reference style: "Fig. 1" in text; tables Arabic (Table 1, Table 2).
- Abstract 342 words (<=350). Word count well under the 8000 limit.

Co-Authored-By: Claude Opus 4.8 <noreply@anthropic.com>
</commit_message>
<xml_diff>
--- a/manuscript/Cover_Letter_MEE.docx
+++ b/manuscript/Cover_Letter_MEE.docx
@@ -4,7 +4,7 @@
   <w:body>
     <w:p>
       <w:pPr>
-        <w:spacing w:after="20" w:line="336"/>
+        <w:spacing w:after="20" w:line="240"/>
       </w:pPr>
       <w:r>
         <w:rPr>
@@ -20,7 +20,7 @@
     </w:p>
     <w:p>
       <w:pPr>
-        <w:spacing w:after="20" w:line="336"/>
+        <w:spacing w:after="20" w:line="240"/>
       </w:pPr>
       <w:r>
         <w:rPr>
@@ -34,7 +34,7 @@
     </w:p>
     <w:p>
       <w:pPr>
-        <w:spacing w:after="40" w:line="336"/>
+        <w:spacing w:after="40" w:line="240"/>
       </w:pPr>
       <w:r>
         <w:rPr>
@@ -56,7 +56,7 @@
     </w:p>
     <w:p>
       <w:pPr>
-        <w:spacing w:after="160" w:line="336"/>
+        <w:spacing w:after="160" w:line="240"/>
       </w:pPr>
       <w:r>
         <w:rPr>
@@ -70,7 +70,7 @@
     </w:p>
     <w:p>
       <w:pPr>
-        <w:spacing w:after="0" w:line="336"/>
+        <w:spacing w:after="0" w:line="240"/>
       </w:pPr>
       <w:r>
         <w:rPr>
@@ -84,7 +84,7 @@
     </w:p>
     <w:p>
       <w:pPr>
-        <w:spacing w:after="0" w:line="336"/>
+        <w:spacing w:after="0" w:line="240"/>
       </w:pPr>
       <w:r>
         <w:rPr>
@@ -100,7 +100,7 @@
     </w:p>
     <w:p>
       <w:pPr>
-        <w:spacing w:after="160" w:line="336"/>
+        <w:spacing w:after="160" w:line="240"/>
       </w:pPr>
       <w:r>
         <w:rPr>
@@ -114,7 +114,7 @@
     </w:p>
     <w:p>
       <w:pPr>
-        <w:spacing w:after="160" w:line="336"/>
+        <w:spacing w:after="160" w:line="240"/>
       </w:pPr>
       <w:r>
         <w:rPr>
@@ -130,7 +130,7 @@
     </w:p>
     <w:p>
       <w:pPr>
-        <w:spacing w:after="120" w:line="336"/>
+        <w:spacing w:after="120" w:line="240"/>
       </w:pPr>
       <w:r>
         <w:rPr>
@@ -144,7 +144,7 @@
     </w:p>
     <w:p>
       <w:pPr>
-        <w:spacing w:after="120" w:line="336"/>
+        <w:spacing w:after="120" w:line="240"/>
       </w:pPr>
       <w:r>
         <w:rPr>
@@ -178,7 +178,7 @@
     </w:p>
     <w:p>
       <w:pPr>
-        <w:spacing w:after="120" w:line="336"/>
+        <w:spacing w:after="120" w:line="240"/>
       </w:pPr>
       <w:r>
         <w:rPr>
@@ -192,7 +192,7 @@
     </w:p>
     <w:p>
       <w:pPr>
-        <w:spacing w:after="120" w:line="336"/>
+        <w:spacing w:after="120" w:line="240"/>
       </w:pPr>
       <w:r>
         <w:rPr>
@@ -206,7 +206,7 @@
     </w:p>
     <w:p>
       <w:pPr>
-        <w:spacing w:after="120" w:line="336"/>
+        <w:spacing w:after="120" w:line="240"/>
       </w:pPr>
       <w:r>
         <w:rPr>
@@ -240,7 +240,7 @@
     </w:p>
     <w:p>
       <w:pPr>
-        <w:spacing w:after="120" w:line="336"/>
+        <w:spacing w:after="120" w:line="240"/>
       </w:pPr>
       <w:r>
         <w:rPr>
@@ -254,7 +254,7 @@
     </w:p>
     <w:p>
       <w:pPr>
-        <w:spacing w:after="120" w:line="336"/>
+        <w:spacing w:after="120" w:line="240"/>
       </w:pPr>
       <w:r>
         <w:rPr>
@@ -273,7 +273,7 @@
     </w:p>
     <w:p>
       <w:pPr>
-        <w:spacing w:after="200" w:line="336"/>
+        <w:spacing w:after="200" w:line="240"/>
       </w:pPr>
       <w:r>
         <w:rPr>
@@ -287,7 +287,7 @@
     </w:p>
     <w:p>
       <w:pPr>
-        <w:spacing w:after="0" w:line="336"/>
+        <w:spacing w:after="0" w:line="240"/>
       </w:pPr>
       <w:r>
         <w:rPr>
@@ -301,7 +301,7 @@
     </w:p>
     <w:p>
       <w:pPr>
-        <w:spacing w:after="0" w:line="336"/>
+        <w:spacing w:after="0" w:line="240"/>
       </w:pPr>
       <w:r>
         <w:rPr>
@@ -315,7 +315,7 @@
     </w:p>
     <w:p>
       <w:pPr>
-        <w:spacing w:after="120" w:line="336"/>
+        <w:spacing w:after="120" w:line="240"/>
       </w:pPr>
       <w:r>
         <w:rPr>
@@ -602,7 +602,7 @@
     </w:rPrDefault>
     <w:pPrDefault>
       <w:pPr>
-        <w:spacing w:after="120" w:line="336"/>
+        <w:spacing w:after="120" w:line="240"/>
       </w:pPr>
     </w:pPrDefault>
   </w:docDefaults>

</xml_diff>